<commit_message>
feat(mandat): choix charge honoraires Vendeur/Acquereur + lettres OLEAN-style + template enrichi
</commit_message>
<xml_diff>
--- a/foncier-idf/public/legal/templates/mandat-vente.template.docx
+++ b/foncier-idf/public/legal/templates/mandat-vente.template.docx
@@ -553,28 +553,10 @@
       <w:r>
         <w:rPr>
           <w:rFonts w:ascii="Calibri" w:hAnsi="Calibri"/>
-          <w:b/>
-          <w:i w:val="0"/>
           <w:color w:val="000000"/>
           <w:sz w:val="22"/>
         </w:rPr>
-        <w:t>Les honoraires de l'Agence sont fixés à {commission_pct} % TTC du prix net vendeur stipulé à l'article 3, soit la somme de {commission_eur} EUR TTC (en lettres : {commission_eur_lettres}).</w:t>
-      </w:r>
-    </w:p>
-    <w:p>
-      <w:pPr>
-        <w:spacing w:after="120" w:line="300" w:lineRule="auto"/>
-        <w:jc w:val="both"/>
-      </w:pPr>
-      <w:r>
-        <w:rPr>
-          <w:rFonts w:ascii="Calibri" w:hAnsi="Calibri"/>
-          <w:b w:val="0"/>
-          <w:i w:val="0"/>
-          <w:color w:val="000000"/>
-          <w:sz w:val="22"/>
-        </w:rPr>
-        <w:t>Ces honoraires sont mis à la CHARGE EXCLUSIVE DE L'ACQUÉREUR, conformément à l'article 6 alinéa 3 de la loi Hoguet et à l'arrêté du 10 janvier 2017. Ils ne seront dus que dans le cas d'une vente effectivement réalisée par l'intermédiaire de l'Agence et constatée par acte authentique reçu par notaire.</w:t>
+        <w:t xml:space="preserve">{article_honoraires_complet}</w:t>
       </w:r>
     </w:p>
     <w:p>

</xml_diff>

<commit_message>
feat(mandat): Sprint A complet - article honoraires + 4 sections OLEAN + lettres FR + Carte T fix
</commit_message>
<xml_diff>
--- a/foncier-idf/public/legal/templates/mandat-vente.template.docx
+++ b/foncier-idf/public/legal/templates/mandat-vente.template.docx
@@ -126,7 +126,7 @@
           <w:color w:val="000000"/>
           <w:sz w:val="22"/>
         </w:rPr>
-        <w:t>EUREALIMMO SARL, société à responsabilité limitée au capital de 100 EUR, dont le siège social est situé Paris (75008), immatriculée au RCS de Paris sous le numéro 984 449 470, SIRET 98444947000017, représentée par M. Samuel BRUNO en sa qualité de gérant, titulaire de la carte professionnelle de transactions sur immeubles et fonds de commerce n° CPI 7501 2024 000 219 délivrée par la CCI Paris Île-de-France le [date délivrance], mention « Transactions », sans maniement de fonds (déclaration CCI Paris au sens de l'article 3-2 de la loi Hoguet — aucune garantie financière requise) ; couverte par une assurance de responsabilité civile professionnelle.</w:t>
+        <w:t>EUREALIMMO SARL, société à responsabilité limitée au capital de 100 EUR, dont le siège social est situé Paris (75008), immatriculée au RCS de Paris sous le numéro 984 449 470, SIRET 98444947000017, représentée par M. Samuel BRUNO en sa qualité de gérant, titulaire de la carte professionnelle de transactions sur immeubles et fonds de commerce n° CPI 7501 2024 000 000 219 délivrée par la CCI Paris Île-de-France le [date délivrance], mention « Transactions », sans maniement de fonds (déclaration CCI Paris au sens de l'article 3-2 de la loi Hoguet — aucune garantie financière requise) ; couverte par une assurance de responsabilité civile professionnelle.</w:t>
       </w:r>
     </w:p>
     <w:p>
@@ -849,6 +849,20 @@
     </w:p>
     <w:p>
       <w:pPr>
+        <w:spacing w:after="120" w:line="300" w:lineRule="auto"/>
+        <w:jc w:val="both"/>
+      </w:pPr>
+      <w:r>
+        <w:rPr>
+          <w:rFonts w:ascii="Calibri" w:hAnsi="Calibri"/>
+          <w:color w:val="000000"/>
+          <w:sz w:val="22"/>
+        </w:rPr>
+        <w:t xml:space="preserve">{clauses_complementaires}</w:t>
+      </w:r>
+    </w:p>
+    <w:p>
+      <w:pPr>
         <w:keepNext/>
         <w:spacing w:before="280" w:after="120"/>
       </w:pPr>
@@ -1006,7 +1020,7 @@
           <w:color w:val="000000"/>
           <w:sz w:val="16"/>
         </w:rPr>
-        <w:t>EUREALIMMO SARL — SIREN 984 449 470 — Carte T CPI 7501 2024 000 219 — Sans maniement de fonds. Le présent mandat est inscrit au registre des mandats du titulaire sous le n° {numero_registre}, conformément à l'article 72 du décret 72-678 du 20 juillet 1972.</w:t>
+        <w:t>EUREALIMMO SARL — SIREN 984 449 470 — Carte T CPI 7501 2024 000 000 219 — Sans maniement de fonds. Le présent mandat est inscrit au registre des mandats du titulaire sous le n° {numero_registre}, conformément à l'article 72 du décret 72-678 du 20 juillet 1972.</w:t>
       </w:r>
     </w:p>
     <w:p>

</xml_diff>

<commit_message>
feat(mandat): integration logo Eurealimmo + fix Mandant/Mandataire + vraies donnees Diara
</commit_message>
<xml_diff>
--- a/foncier-idf/public/legal/templates/mandat-vente.template.docx
+++ b/foncier-idf/public/legal/templates/mandat-vente.template.docx
@@ -2,6 +2,49 @@
 <file path=word/document.xml><?xml version="1.0" encoding="utf-8"?>
 <w:document xmlns:wpc="http://schemas.microsoft.com/office/word/2010/wordprocessingCanvas" xmlns:mo="http://schemas.microsoft.com/office/mac/office/2008/main" xmlns:mc="http://schemas.openxmlformats.org/markup-compatibility/2006" xmlns:mv="urn:schemas-microsoft-com:mac:vml" xmlns:o="urn:schemas-microsoft-com:office:office" xmlns:r="http://schemas.openxmlformats.org/officeDocument/2006/relationships" xmlns:m="http://schemas.openxmlformats.org/officeDocument/2006/math" xmlns:v="urn:schemas-microsoft-com:vml" xmlns:wp14="http://schemas.microsoft.com/office/word/2010/wordprocessingDrawing" xmlns:wp="http://schemas.openxmlformats.org/drawingml/2006/wordprocessingDrawing" xmlns:w10="urn:schemas-microsoft-com:office:word" xmlns:w="http://schemas.openxmlformats.org/wordprocessingml/2006/main" xmlns:w14="http://schemas.microsoft.com/office/word/2010/wordml" xmlns:wpg="http://schemas.microsoft.com/office/word/2010/wordprocessingGroup" xmlns:wpi="http://schemas.microsoft.com/office/word/2010/wordprocessingInk" xmlns:wne="http://schemas.microsoft.com/office/word/2006/wordml" xmlns:wps="http://schemas.microsoft.com/office/word/2010/wordprocessingShape" mc:Ignorable="w14 wp14">
   <w:body>
+    <w:p>
+      <w:pPr>
+        <w:jc w:val="center"/>
+        <w:spacing w:after="120"/>
+      </w:pPr>
+      <w:r>
+        <w:drawing>
+          <wp:inline xmlns:wp="http://schemas.openxmlformats.org/drawingml/2006/wordprocessingDrawing" distT="0" distB="0" distL="0" distR="0">
+            <wp:extent cx="2160000" cy="600641"/>
+            <wp:effectExtent l="0" t="0" r="0" b="0"/>
+            <wp:docPr id="1" name="Logo Eurealimmo"/>
+            <wp:cNvGraphicFramePr>
+              <a:graphicFrameLocks xmlns:a="http://schemas.openxmlformats.org/drawingml/2006/main" noChangeAspect="1"/>
+            </wp:cNvGraphicFramePr>
+            <a:graphic xmlns:a="http://schemas.openxmlformats.org/drawingml/2006/main">
+              <a:graphicData uri="http://schemas.openxmlformats.org/drawingml/2006/picture">
+                <pic:pic xmlns:pic="http://schemas.openxmlformats.org/drawingml/2006/picture">
+                  <pic:nvPicPr>
+                    <pic:cNvPr id="1" name="Logo Eurealimmo"/>
+                    <pic:cNvPicPr/>
+                  </pic:nvPicPr>
+                  <pic:blipFill>
+                    <a:blip xmlns:r="http://schemas.openxmlformats.org/officeDocument/2006/relationships" r:embed="rId9"/>
+                    <a:stretch>
+                      <a:fillRect/>
+                    </a:stretch>
+                  </pic:blipFill>
+                  <pic:spPr>
+                    <a:xfrm>
+                      <a:off x="0" y="0"/>
+                      <a:ext cx="2160000" cy="600641"/>
+                    </a:xfrm>
+                    <a:prstGeom prst="rect">
+                      <a:avLst/>
+                    </a:prstGeom>
+                  </pic:spPr>
+                </pic:pic>
+              </a:graphicData>
+            </a:graphic>
+          </wp:inline>
+        </w:drawing>
+      </w:r>
+    </w:p>
     <w:p>
       <w:pPr>
         <w:spacing w:after="80"/>
@@ -110,7 +153,7 @@
           <w:color w:val="000000"/>
           <w:sz w:val="22"/>
         </w:rPr>
-        <w:t>LE MANDANT (Titulaire de la carte T)</w:t>
+        <w:t>LE MANDATAIRE</w:t>
       </w:r>
     </w:p>
     <w:p>
@@ -158,7 +201,7 @@
           <w:color w:val="000000"/>
           <w:sz w:val="22"/>
         </w:rPr>
-        <w:t>Ci-après dénommée « l'Agence » ou « le Mandataire (titulaire) »,</w:t>
+        <w:t>Ci-après dénommée « l'Agence » ou « le Mandataire »,</w:t>
       </w:r>
     </w:p>
     <w:p>
@@ -190,7 +233,7 @@
           <w:color w:val="000000"/>
           <w:sz w:val="22"/>
         </w:rPr>
-        <w:t>LE CLIENT (Mandant économique au sens du présent mandat)</w:t>
+        <w:t>LE MANDANT</w:t>
       </w:r>
     </w:p>
     <w:p>
@@ -222,7 +265,7 @@
           <w:color w:val="000000"/>
           <w:sz w:val="22"/>
         </w:rPr>
-        <w:t>Ci-après dénommé(e) « le Client » ou « le Mandant économique »,</w:t>
+        <w:t>Ci-après dénommé(e) « le Mandant »,</w:t>
       </w:r>
     </w:p>
     <w:p>

</xml_diff>

<commit_message>
fix(ui): retirer mention 'style OLEAN' (ref concurrent) - garder fonctionnalite Vendeur/Acquereur
</commit_message>
<xml_diff>
--- a/foncier-idf/public/legal/templates/mandat-vente.template.docx
+++ b/foncier-idf/public/legal/templates/mandat-vente.template.docx
@@ -591,7 +591,7 @@
     <w:p>
       <w:pPr>
         <w:spacing w:after="120" w:line="300" w:lineRule="auto"/>
-        <w:jc w:val="both"/>
+        <w:jc w:val="left"/>
       </w:pPr>
       <w:r>
         <w:rPr>
@@ -893,7 +893,7 @@
     <w:p>
       <w:pPr>
         <w:spacing w:after="120" w:line="300" w:lineRule="auto"/>
-        <w:jc w:val="both"/>
+        <w:jc w:val="left"/>
       </w:pPr>
       <w:r>
         <w:rPr>

</xml_diff>